<commit_message>
Review fixes: Second Act Workbook (US English, title page, answer blocks, names); guide rules and checks
Book: US spelling and dollars, title page added, answer blocks after every prompt and review
question, Anna renamed Laura, Desmond renamed Gerald in Chapter 3, Maya's sourdough example
changed, review notes rewritten to record only what ran.

Guide: US English, US dollars, title page, workbook answer blocks, distinct names, sourced
claims, test-run and review-note rules, fix-or-stop rows, checklist items, change log, and a
new section 20 that lists each mistake and the rule that stops it.

Scripts: check_language.py (new) runs in check_book.py with title-page and answer-block
checks. make_kdp_answers.py writes 'enroll'.

Co-Authored-By: Claude Haiku 5.5 <noreply@anthropic.com>
Claude-Session: https://claude.ai/code/session_01MZeVJcyf7XvKRRCE6AUkLk
</commit_message>
<xml_diff>
--- a/ebooks-Final/the-second-act-workbook-a-30-day-guided-reflection-journal-for-starting-over-after-work/manuscript.docx
+++ b/ebooks-Final/the-second-act-workbook-a-30-day-guided-reflection-journal-for-starting-over-after-work/manuscript.docx
@@ -2,6 +2,41 @@
 <file path=word/document.xml><?xml version="1.0" encoding="utf-8"?>
 <w:document xmlns:w="http://schemas.openxmlformats.org/wordprocessingml/2006/main" xmlns:m="http://schemas.openxmlformats.org/officeDocument/2006/math" xmlns:r="http://schemas.openxmlformats.org/officeDocument/2006/relationships" xmlns:o="urn:schemas-microsoft-com:office:office" xmlns:v="urn:schemas-microsoft-com:vml" xmlns:w10="urn:schemas-microsoft-com:office:word" xmlns:a="http://schemas.openxmlformats.org/drawingml/2006/main" xmlns:pic="http://schemas.openxmlformats.org/drawingml/2006/picture" xmlns:wp="http://schemas.openxmlformats.org/drawingml/2006/wordprocessingDrawing">
   <w:body>
+    <w:p>
+      <w:pPr>
+        <w:pStyle w:val="FirstParagraph"/>
+      </w:pPr>
+      <w:r>
+        <w:rPr>
+          <w:bCs/>
+          <w:b/>
+        </w:rPr>
+        <w:t xml:space="preserve">The Second Act Workbook</w:t>
+      </w:r>
+    </w:p>
+    <w:p>
+      <w:pPr>
+        <w:pStyle w:val="BodyText"/>
+      </w:pPr>
+      <w:r>
+        <w:t xml:space="preserve">A 30-Day Guided Journal for Starting Over After Work</w:t>
+      </w:r>
+    </w:p>
+    <w:p>
+      <w:pPr>
+        <w:pStyle w:val="BodyText"/>
+      </w:pPr>
+      <w:r>
+        <w:t xml:space="preserve">By Skybee</w:t>
+      </w:r>
+    </w:p>
+    <w:p>
+      <w:r>
+        <w:pict>
+          <v:rect style="width:0;height:1.5pt" o:hralign="center" o:hrstd="t" o:hr="t"/>
+        </w:pict>
+      </w:r>
+    </w:p>
     <w:bookmarkStart w:id="20" w:name="copyright"/>
     <w:p>
       <w:pPr>
@@ -66,7 +101,7 @@
         <w:pStyle w:val="BodyText"/>
       </w:pPr>
       <w:r>
-        <w:t xml:space="preserve">The book is organised as a 30-day course. Each day has a short prompt, usually one to three sentences, and a space in your mind, or on the page, for your answer. The days are grouped into ten chapters. Chapter 1 asks you to look at what your work gave you beyond a paycheck. The middle chapters ask you to observe your days carefully, reconnect with the people and interests you have set aside, and try small experiments. The last chapters help you set boundaries, build a flexible weekly rhythm and write a one-page plan. The book closes with a 90-day review sheet, so the work does not end on day 30.</w:t>
+        <w:t xml:space="preserve">The book is organized as a 30-day course. Each day has a short prompt, usually one to three sentences, and a space in your mind, or on the page, for your answer. The days are grouped into ten chapters. Chapter 1 asks you to look at what your work gave you beyond a paycheck. The middle chapters ask you to observe your days carefully, reconnect with the people and interests you have set aside, and try small experiments. The last chapters help you set boundaries, build a flexible weekly rhythm and write a one-page plan. The book closes with a 90-day review sheet, so the work does not end on day 30.</w:t>
       </w:r>
     </w:p>
     <w:p>
@@ -90,15 +125,15 @@
         <w:pStyle w:val="BodyText"/>
       </w:pPr>
       <w:r>
-        <w:t xml:space="preserve">A word about the stories. Each chapter opens with a short story about a reader who is working through the same questions you may be asking. The people in these stories are invented composites, not real people, and their details are changed. They are there to show that the questions are common, and that answers can look very different from one person to the next. You may recognise yourself in one of them. You may not recognise yourself at all. Either is fine.</w:t>
-      </w:r>
-    </w:p>
-    <w:p>
-      <w:pPr>
-        <w:pStyle w:val="BodyText"/>
-      </w:pPr>
-      <w:r>
-        <w:t xml:space="preserve">This workbook does not give financial, medical, or legal advice. You will find no prompts about investments, pensions, budgets, or health conditions. If a question in your life needs one of those kinds of help, the right step is to speak with a qualified professional, such as a financial adviser, a doctor, a counsellor or a solicitor. The prompts here will help you prepare for that conversation, if you want to, but they cannot replace it.</w:t>
+        <w:t xml:space="preserve">A word about the stories. Each chapter opens with a short story about a reader who is working through the same questions you may be asking. The people in these stories are invented composites, not real people, and their details are changed. They are there to show that the questions are common, and that answers can look very different from one person to the next. You may recognize yourself in one of them. You may not recognize yourself at all. Either is fine.</w:t>
+      </w:r>
+    </w:p>
+    <w:p>
+      <w:pPr>
+        <w:pStyle w:val="BodyText"/>
+      </w:pPr>
+      <w:r>
+        <w:t xml:space="preserve">This workbook does not give financial, medical, or legal advice. You will find no prompts about investments, pensions, budgets, or health conditions. If a question in your life needs one of those kinds of help, the right step is to speak with a qualified professional, such as a financial advisor, a doctor, a counselor or an attorney. The prompts here will help you prepare for that conversation, if you want to, but they cannot replace it.</w:t>
       </w:r>
     </w:p>
     <w:p>
@@ -151,7 +186,7 @@
         <w:t xml:space="preserve"> </w:t>
       </w:r>
       <w:r>
-        <w:t xml:space="preserve">Some people leave work because of illness, redundancy, a family crisis or the closure of a business. For them, the first weeks may be dominated by loss and anger rather than curiosity. The workbook does not ask you to feel differently. It asks you to notice what is true now, one day at a time. If the difficulty is heavy or lasting, a doctor or counsellor can help, and writing about it can be a useful companion to that help.</w:t>
+        <w:t xml:space="preserve">Some people leave work because of illness, redundancy, a family crisis or the closure of a business. For them, the first weeks may be dominated by loss and anger rather than curiosity. The workbook does not ask you to feel differently. It asks you to notice what is true now, one day at a time. If the difficulty is heavy or lasting, a doctor or counselor can help, and writing about it can be a useful companion to that help.</w:t>
       </w:r>
     </w:p>
     <w:p>
@@ -242,15 +277,15 @@
         <w:pStyle w:val="FirstParagraph"/>
       </w:pPr>
       <w:r>
-        <w:t xml:space="preserve">Harriet kept her work badge in the kitchen drawer, beside the takeaway menus and the spare keys. It had her photograph on it, taken eleven years earlier, and a logo for a company that had since been bought and renamed twice. She had meant to throw it away the week she retired. Instead, she put it in the drawer, and every time she reached for a pen she saw it there.</w:t>
-      </w:r>
-    </w:p>
-    <w:p>
-      <w:pPr>
-        <w:pStyle w:val="BodyText"/>
-      </w:pPr>
-      <w:r>
-        <w:t xml:space="preserve">For the first month, Harriet filled her days with tidying. She reorganised the garage, cleared the loft and sorted her photographs into albums. These were good jobs, and she was proud of them. But by the end of the month she felt a hollow tiredness that she could not name. She had spent thirty-four years being useful to people who depended on her. Now she was useful only to the recycling bin.</w:t>
+        <w:t xml:space="preserve">Harriet kept her work badge in the kitchen drawer, beside the takeout menus and the spare keys. It had her photograph on it, taken eleven years earlier, and a logo for a company that had since been bought and renamed twice. She had meant to throw it away the week she retired. Instead, she put it in the drawer, and every time she reached for a pen she saw it there.</w:t>
+      </w:r>
+    </w:p>
+    <w:p>
+      <w:pPr>
+        <w:pStyle w:val="BodyText"/>
+      </w:pPr>
+      <w:r>
+        <w:t xml:space="preserve">For the first month, Harriet filled her days with tidying. She reorganized the garage, cleared the attic and sorted her photographs into albums. These were good jobs, and she was proud of them. But by the end of the month she felt a hollow tiredness that she could not name. She had spent thirty-four years being useful to people who depended on her. Now she was useful only to the recycling bin.</w:t>
       </w:r>
     </w:p>
     <w:p>
@@ -290,7 +325,7 @@
         <w:pStyle w:val="BodyText"/>
       </w:pPr>
       <w:r>
-        <w:t xml:space="preserve">It also helps to separate three things that often arrive together in a job: income, identity and structure. Income is the money. Identity is the sense of who you are when someone asks what you do. Structure is the shape of the day, the reasons to get up and the people who expect you somewhere. Retirement or a career break usually removes all three at once, and it is easy to grieve the wrong one. A person who misses the structure may feel that they have lost their purpose, when what they really need is a new timetable. A person who misses the identity may find that a few hours of volunteering solve the problem, while a person who misses the money may need to look at their finances with a qualified adviser. This workbook cannot tell you which of these applies to you. The prompts in this chapter help you notice which one feels loudest.</w:t>
+        <w:t xml:space="preserve">It also helps to separate three things that often arrive together in a job: income, identity and structure. Income is the money. Identity is the sense of who you are when someone asks what you do. Structure is the shape of the day, the reasons to get up and the people who expect you somewhere. Retirement or a career break usually removes all three at once, and it is easy to grieve the wrong one. A person who misses the structure may feel that they have lost their purpose, when what they really need is a new timetable. A person who misses the identity may find that a few hours of volunteering solve the problem, while a person who misses the money may need to look at their finances with a qualified advisor. This workbook cannot tell you which of these applies to you. The prompts in this chapter help you notice which one feels loudest.</w:t>
       </w:r>
     </w:p>
     <w:p>
@@ -309,7 +344,7 @@
         <w:t xml:space="preserve">“</w:t>
       </w:r>
       <w:r>
-        <w:t xml:space="preserve">1. People asked my opinion and then listened to it. 2. I had a reason to iron a shirt on a Monday. 3. The team at the end of the corridor brought biscuits when we were behind on a deadline. 4. I got better at spotting a problem before it became a crisis. 5. Lunch with Anita, every Thursday, for eleven years.</w:t>
+        <w:t xml:space="preserve">1. People asked my opinion and then listened to it. 2. I had a reason to iron a shirt on a Monday. 3. The team at the end of the corridor brought cookies when we were behind on a deadline. 4. I got better at spotting a problem before it became a crisis. 5. Lunch with Anita, every Thursday, for eleven years.</w:t>
       </w:r>
       <w:r>
         <w:t xml:space="preserve">”</w:t>
@@ -346,6 +381,42 @@
       </w:pPr>
       <w:r>
         <w:t xml:space="preserve">Think about your working life, or the last job you held. Write down five things it gave you that had nothing to do with your salary. They might be a sense of being needed, a team that laughed at the same jokes, a reason to dress a certain way, or a feeling of getting better at something over time. Do not worry about getting the list perfect. Write the first five things that come to mind, then read them back and notice which one makes your shoulders drop a little.</w:t>
+      </w:r>
+    </w:p>
+    <w:p>
+      <w:pPr>
+        <w:pStyle w:val="BodyText"/>
+      </w:pPr>
+      <w:r>
+        <w:rPr>
+          <w:bCs/>
+          <w:b/>
+        </w:rPr>
+        <w:t xml:space="preserve">Your answer:</w:t>
+      </w:r>
+    </w:p>
+    <w:p>
+      <w:pPr>
+        <w:pStyle w:val="BodyText"/>
+      </w:pPr>
+      <w:r>
+        <w:t xml:space="preserve">________________________________________</w:t>
+      </w:r>
+    </w:p>
+    <w:p>
+      <w:pPr>
+        <w:pStyle w:val="BodyText"/>
+      </w:pPr>
+      <w:r>
+        <w:t xml:space="preserve">________________________________________</w:t>
+      </w:r>
+    </w:p>
+    <w:p>
+      <w:pPr>
+        <w:pStyle w:val="BodyText"/>
+      </w:pPr>
+      <w:r>
+        <w:t xml:space="preserve">________________________________________</w:t>
       </w:r>
     </w:p>
     <w:bookmarkEnd w:id="23"/>
@@ -366,6 +437,42 @@
         <w:t xml:space="preserve">Describe a typical working day from start to finish, as clearly as you can remember it. Where did you start? What was the first thing you did? When did you eat, and with whom? When did the day end, and what did you do then? Then write one sentence about the part of that rhythm you miss most, and one sentence about the part you are glad to be free of. You may find that the two sentences are about the same part of the day.</w:t>
       </w:r>
     </w:p>
+    <w:p>
+      <w:pPr>
+        <w:pStyle w:val="BodyText"/>
+      </w:pPr>
+      <w:r>
+        <w:rPr>
+          <w:bCs/>
+          <w:b/>
+        </w:rPr>
+        <w:t xml:space="preserve">Your answer:</w:t>
+      </w:r>
+    </w:p>
+    <w:p>
+      <w:pPr>
+        <w:pStyle w:val="BodyText"/>
+      </w:pPr>
+      <w:r>
+        <w:t xml:space="preserve">________________________________________</w:t>
+      </w:r>
+    </w:p>
+    <w:p>
+      <w:pPr>
+        <w:pStyle w:val="BodyText"/>
+      </w:pPr>
+      <w:r>
+        <w:t xml:space="preserve">________________________________________</w:t>
+      </w:r>
+    </w:p>
+    <w:p>
+      <w:pPr>
+        <w:pStyle w:val="BodyText"/>
+      </w:pPr>
+      <w:r>
+        <w:t xml:space="preserve">________________________________________</w:t>
+      </w:r>
+    </w:p>
     <w:bookmarkEnd w:id="24"/>
     <w:bookmarkStart w:id="25" w:name="day-3-the-moment-you-felt-useful"/>
     <w:p>
@@ -384,6 +491,42 @@
         <w:t xml:space="preserve">Recall a specific moment in your working life when you felt truly valuable. It does not need to be a great achievement. It might be the afternoon a colleague thanked you for explaining something, the day a difficult customer left satisfied, or the quiet moment when a problem you had worried about finally resolved. Describe the moment in detail: where you were, what you were doing, who was there, and how it felt in your body. Then ask yourself what kind of usefulness it was. Was it about solving problems, about helping people, about making something, or about keeping things running? Keep your answer. You will return to it in Chapter 3.</w:t>
       </w:r>
     </w:p>
+    <w:p>
+      <w:pPr>
+        <w:pStyle w:val="BodyText"/>
+      </w:pPr>
+      <w:r>
+        <w:rPr>
+          <w:bCs/>
+          <w:b/>
+        </w:rPr>
+        <w:t xml:space="preserve">Your answer:</w:t>
+      </w:r>
+    </w:p>
+    <w:p>
+      <w:pPr>
+        <w:pStyle w:val="BodyText"/>
+      </w:pPr>
+      <w:r>
+        <w:t xml:space="preserve">________________________________________</w:t>
+      </w:r>
+    </w:p>
+    <w:p>
+      <w:pPr>
+        <w:pStyle w:val="BodyText"/>
+      </w:pPr>
+      <w:r>
+        <w:t xml:space="preserve">________________________________________</w:t>
+      </w:r>
+    </w:p>
+    <w:p>
+      <w:pPr>
+        <w:pStyle w:val="BodyText"/>
+      </w:pPr>
+      <w:r>
+        <w:t xml:space="preserve">________________________________________</w:t>
+      </w:r>
+    </w:p>
     <w:bookmarkEnd w:id="25"/>
     <w:bookmarkStart w:id="26" w:name="going-further-work-as-identity"/>
     <w:p>
@@ -443,7 +586,7 @@
         <w:t xml:space="preserve"> </w:t>
       </w:r>
       <w:r>
-        <w:t xml:space="preserve">The third should describe who you are, without any job at all. Read the three answers aloud. Notice which one feels most true, and which one you would prefer to give in six months. You do not need to choose one answer forever. You are simply practising the sentences that will one day come out of your mouth without much thought.</w:t>
+        <w:t xml:space="preserve">The third should describe who you are, without any job at all. Read the three answers aloud. Notice which one feels most true, and which one you would prefer to give in six months. You do not need to choose one answer forever. You are simply practicing the sentences that will one day come out of your mouth without much thought.</w:t>
       </w:r>
     </w:p>
     <w:p>
@@ -470,15 +613,15 @@
         <w:pStyle w:val="FirstParagraph"/>
       </w:pPr>
       <w:r>
-        <w:t xml:space="preserve">Malcolm believed he was a man with plenty of free time. He had said so to his sister on the phone, and to the neighbour who asked whether he was enjoying retirement. Then his daughter asked him, reasonably enough, what he had done on a Wednesday the previous week. He could not remember. He knew he had gone to the shops, had lunch and watched some television. Beyond that, the day had dissolved.</w:t>
-      </w:r>
-    </w:p>
-    <w:p>
-      <w:pPr>
-        <w:pStyle w:val="BodyText"/>
-      </w:pPr>
-      <w:r>
-        <w:t xml:space="preserve">Malcolm decided to keep a log for a week. He was sceptical about it. He thought he would find that he did very little, and he was ready to feel bad about that. Instead he discovered something more useful. He spent well over an hour each morning reading the news on his phone, which he had not realised. He spent a further hour each afternoon waiting for the post, which had not arrived at a regular time for years. And he spent most of Saturday in a state of mild restlessness that he had been calling relaxation.</w:t>
+        <w:t xml:space="preserve">Malcolm believed he was a man with plenty of free time. He had said so to his sister on the phone, and to the neighbor who asked whether he was enjoying retirement. Then his daughter asked him, reasonably enough, what he had done on a Wednesday the previous week. He could not remember. He knew he had gone to the stores, had lunch and watched some television. Beyond that, the day had dissolved.</w:t>
+      </w:r>
+    </w:p>
+    <w:p>
+      <w:pPr>
+        <w:pStyle w:val="BodyText"/>
+      </w:pPr>
+      <w:r>
+        <w:t xml:space="preserve">Malcolm decided to keep a log for a week. He was skeptical about it. He thought he would find that he did very little, and he was ready to feel bad about that. Instead he discovered something more useful. He spent well over an hour each morning reading the news on his phone, which he had not realized. He spent a further hour each afternoon waiting for the mail, which had not arrived at a regular time for years. And he spent most of Saturday in a state of mild restlessness that he had been calling relaxation.</w:t>
       </w:r>
     </w:p>
     <w:p>
@@ -537,7 +680,7 @@
         <w:t xml:space="preserve">“</w:t>
       </w:r>
       <w:r>
-        <w:t xml:space="preserve">Tuesday. 7:00 woke, tea, bed-made. 7:30 to 8:45 phone news, scrolling, felt uneasy. 9:00 walked to the shops for milk and forgot the bread. 10:15 read two chapters of a novel, calm. 11:00 phoned sister, lovely, forty minutes. 12:30 lunch, alone, radio. 14:00 waited in for the parcel, bored. 15:30 tidied the spare room, satisfied. 18:00 dinner with Jane on the video call, warm. 21:00 television, could not remember afterwards.</w:t>
+        <w:t xml:space="preserve">Tuesday. 7:00 woke, tea, bed-made. 7:30 to 8:45 phone news, scrolling, felt uneasy. 9:00 walked to the stores for milk and forgot the bread. 10:15 read two chapters of a novel, calm. 11:00 phoned sister, lovely, forty minutes. 12:30 lunch, alone, radio. 14:00 waited in for the parcel, bored. 15:30 tidied the spare room, satisfied. 18:00 dinner with Jane on the video call, warm. 21:00 television, could not remember afterwards.</w:t>
       </w:r>
       <w:r>
         <w:t xml:space="preserve">”</w:t>
@@ -574,6 +717,42 @@
       </w:pPr>
       <w:r>
         <w:t xml:space="preserve">Set up your log before you go to bed tonight. Draw a line down a page for each day of the coming week, or create the same layout in a file. Write the day and date at the top. Then, for today, write what you did from the moment you woke up until now. Include small things, such as the time you spent on your phone, and the conversations you had. Add one word after each entry that describes how it felt: calm, bored, rushed, pleased, or anything else that is true for you.</w:t>
+      </w:r>
+    </w:p>
+    <w:p>
+      <w:pPr>
+        <w:pStyle w:val="BodyText"/>
+      </w:pPr>
+      <w:r>
+        <w:rPr>
+          <w:bCs/>
+          <w:b/>
+        </w:rPr>
+        <w:t xml:space="preserve">Your answer:</w:t>
+      </w:r>
+    </w:p>
+    <w:p>
+      <w:pPr>
+        <w:pStyle w:val="BodyText"/>
+      </w:pPr>
+      <w:r>
+        <w:t xml:space="preserve">________________________________________</w:t>
+      </w:r>
+    </w:p>
+    <w:p>
+      <w:pPr>
+        <w:pStyle w:val="BodyText"/>
+      </w:pPr>
+      <w:r>
+        <w:t xml:space="preserve">________________________________________</w:t>
+      </w:r>
+    </w:p>
+    <w:p>
+      <w:pPr>
+        <w:pStyle w:val="BodyText"/>
+      </w:pPr>
+      <w:r>
+        <w:t xml:space="preserve">________________________________________</w:t>
       </w:r>
     </w:p>
     <w:bookmarkEnd w:id="28"/>
@@ -594,6 +773,42 @@
         <w:t xml:space="preserve">Look at your log for the first two days. Find the three hours that felt most unplanned, and write down what you were actually doing during each one. Then find the three hours that you would describe as most meaningful, and do the same. Compare the two lists. What do the meaningful hours have in common? Is there anything they share with the hours you did not value?</w:t>
       </w:r>
     </w:p>
+    <w:p>
+      <w:pPr>
+        <w:pStyle w:val="BodyText"/>
+      </w:pPr>
+      <w:r>
+        <w:rPr>
+          <w:bCs/>
+          <w:b/>
+        </w:rPr>
+        <w:t xml:space="preserve">Your answer:</w:t>
+      </w:r>
+    </w:p>
+    <w:p>
+      <w:pPr>
+        <w:pStyle w:val="BodyText"/>
+      </w:pPr>
+      <w:r>
+        <w:t xml:space="preserve">________________________________________</w:t>
+      </w:r>
+    </w:p>
+    <w:p>
+      <w:pPr>
+        <w:pStyle w:val="BodyText"/>
+      </w:pPr>
+      <w:r>
+        <w:t xml:space="preserve">________________________________________</w:t>
+      </w:r>
+    </w:p>
+    <w:p>
+      <w:pPr>
+        <w:pStyle w:val="BodyText"/>
+      </w:pPr>
+      <w:r>
+        <w:t xml:space="preserve">________________________________________</w:t>
+      </w:r>
+    </w:p>
     <w:bookmarkEnd w:id="29"/>
     <w:bookmarkStart w:id="30" w:name="X2ee9feac4bf9e79560e38d9da02356dd4015333"/>
     <w:p>
@@ -610,6 +825,42 @@
       </w:pPr>
       <w:r>
         <w:t xml:space="preserve">Complete your log for the rest of the week. When you have finished, count the hours you spent on five groups of activity: rest, practical tasks, time with other people, learning or making things, and time alone with no particular purpose. Write the approximate number of hours for each group. Then write one sentence describing what surprised you most. Keep this summary. It is the starting point for the experiments in Chapter 6.</w:t>
+      </w:r>
+    </w:p>
+    <w:p>
+      <w:pPr>
+        <w:pStyle w:val="BodyText"/>
+      </w:pPr>
+      <w:r>
+        <w:rPr>
+          <w:bCs/>
+          <w:b/>
+        </w:rPr>
+        <w:t xml:space="preserve">Your answer:</w:t>
+      </w:r>
+    </w:p>
+    <w:p>
+      <w:pPr>
+        <w:pStyle w:val="BodyText"/>
+      </w:pPr>
+      <w:r>
+        <w:t xml:space="preserve">________________________________________</w:t>
+      </w:r>
+    </w:p>
+    <w:p>
+      <w:pPr>
+        <w:pStyle w:val="BodyText"/>
+      </w:pPr>
+      <w:r>
+        <w:t xml:space="preserve">________________________________________</w:t>
+      </w:r>
+    </w:p>
+    <w:p>
+      <w:pPr>
+        <w:pStyle w:val="BodyText"/>
+      </w:pPr>
+      <w:r>
+        <w:t xml:space="preserve">________________________________________</w:t>
       </w:r>
     </w:p>
     <w:bookmarkEnd w:id="30"/>
@@ -670,7 +921,7 @@
         <w:pStyle w:val="BodyText"/>
       </w:pPr>
       <w:r>
-        <w:t xml:space="preserve">The turning point came when the school at the end of her street asked for help. The parent volunteers had no one to keep the accounts for the summer fete, and the money was in a shoebox. Priya offered to look at it. Within an afternoon she had organised the receipts, found an error of forty pounds, and set up a simple table that the next volunteer could follow. The head teacher asked whether she would be willing to help with the spring fundraiser too. Priya was delighted, and a little embarrassed that the work felt so easy.</w:t>
+        <w:t xml:space="preserve">The turning point came when the school at the end of her street asked for help. The parent volunteers had no one to keep the accounts for the summer fair, and the money was in a shoebox. Priya offered to look at it. Within an afternoon she had organized the receipts, found an error of forty dollars, and set up a simple table that the next volunteer could follow. The head teacher asked whether she would be willing to help with the spring fundraiser too. Priya was delighted, and a little embarrassed that the work felt so easy.</w:t>
       </w:r>
     </w:p>
     <w:p>
@@ -722,7 +973,7 @@
         <w:pStyle w:val="BodyText"/>
       </w:pPr>
       <w:r>
-        <w:t xml:space="preserve">Many people make the same mistake. They think of their work skills as attached to a job title, and so they assume the skills disappear when the job does. In fact, most of what you learned at work is a set of abilities: planning, explaining, listening, organising, negotiating, teaching, fixing, caring and checking. These abilities travel. A volunteer group needs them. So does a family, a neighbourhood association, a choir committee and a local sports club.</w:t>
+        <w:t xml:space="preserve">Many people make the same mistake. They think of their work skills as attached to a job title, and so they assume the skills disappear when the job does. In fact, most of what you learned at work is a set of abilities: planning, explaining, listening, organizing, negotiating, teaching, fixing, caring and checking. These abilities travel. A volunteer group needs them. So does a family, a neighborhood association, a choir committee and a local sports club.</w:t>
       </w:r>
     </w:p>
     <w:p>
@@ -738,7 +989,7 @@
         <w:pStyle w:val="BodyText"/>
       </w:pPr>
       <w:r>
-        <w:t xml:space="preserve">Many people who have worked in a profession for years carry skills they no longer recognise as skills. Things that feel natural after decades, such as reading a room, knowing which question to ask next or finding the error in a spreadsheet, can seem too ordinary to mention. That modesty is understandable, but it can cost you. When you do not name your abilities, you do not see the places where they are needed.</w:t>
+        <w:t xml:space="preserve">Many people who have worked in a profession for years carry skills they no longer recognize as skills. Things that feel natural after decades, such as reading a room, knowing which question to ask next or finding the error in a spreadsheet, can seem too ordinary to mention. That modesty is understandable, but it can cost you. When you do not name your abilities, you do not see the places where they are needed.</w:t>
       </w:r>
     </w:p>
     <w:p>
@@ -754,7 +1005,7 @@
         <w:pStyle w:val="BodyText"/>
       </w:pPr>
       <w:r>
-        <w:t xml:space="preserve">Here is how one reader, Desmond, described an ability he had almost forgotten he possessed:</w:t>
+        <w:t xml:space="preserve">Here is how one reader, Gerald, described an ability he had almost forgotten he possessed:</w:t>
       </w:r>
       <w:r>
         <w:t xml:space="preserve"> </w:t>
@@ -782,7 +1033,7 @@
         <w:pStyle w:val="BodyText"/>
       </w:pPr>
       <w:r>
-        <w:t xml:space="preserve">It may also help to notice the gaps. Some people find that they would like to learn something new, such as a language, a craft or a digital tool. Others realise that they have plenty of skills but lack the confidence to use them. Either finding is useful. Write the gaps down in the margins of your list, without judging them, and return to them in Chapter 6.</w:t>
+        <w:t xml:space="preserve">It may also help to notice the gaps. Some people find that they would like to learn something new, such as a language, a craft or a digital tool. Others realize that they have plenty of skills but lack the confidence to use them. Either finding is useful. Write the gaps down in the margins of your list, without judging them, and return to them in Chapter 6.</w:t>
       </w:r>
     </w:p>
     <w:bookmarkStart w:id="33" w:name="Xa97b4713548f04116bb0602dc8058702121c3cc"/>
@@ -848,6 +1099,42 @@
       </w:r>
       <w:r>
         <w:t xml:space="preserve">Aim for at least fifteen. If you are stuck, think about the tasks you did without needing to look anything up, and the tasks other people always asked you to do.</w:t>
+      </w:r>
+    </w:p>
+    <w:p>
+      <w:pPr>
+        <w:pStyle w:val="BodyText"/>
+      </w:pPr>
+      <w:r>
+        <w:rPr>
+          <w:bCs/>
+          <w:b/>
+        </w:rPr>
+        <w:t xml:space="preserve">Your answer:</w:t>
+      </w:r>
+    </w:p>
+    <w:p>
+      <w:pPr>
+        <w:pStyle w:val="BodyText"/>
+      </w:pPr>
+      <w:r>
+        <w:t xml:space="preserve">________________________________________</w:t>
+      </w:r>
+    </w:p>
+    <w:p>
+      <w:pPr>
+        <w:pStyle w:val="BodyText"/>
+      </w:pPr>
+      <w:r>
+        <w:t xml:space="preserve">________________________________________</w:t>
+      </w:r>
+    </w:p>
+    <w:p>
+      <w:pPr>
+        <w:pStyle w:val="BodyText"/>
+      </w:pPr>
+      <w:r>
+        <w:t xml:space="preserve">________________________________________</w:t>
       </w:r>
     </w:p>
     <w:bookmarkEnd w:id="33"/>
@@ -865,7 +1152,43 @@
         <w:pStyle w:val="FirstParagraph"/>
       </w:pPr>
       <w:r>
-        <w:t xml:space="preserve">Choose five abilities from yesterday’s list. For each one, write a sentence describing a place outside paid work where that ability might help. Think about your household, your street, a religious or cultural group, a library, a charity shop, a sports team, a school, or an online community you already belong to. Write what the place needs and how your ability would meet that need. You do not have to act on any of these yet. The point is to see the links.</w:t>
+        <w:t xml:space="preserve">Choose five abilities from yesterday’s list. For each one, write a sentence describing a place outside paid work where that ability might help. Think about your household, your street, a religious or cultural group, a library, a thrift store, a sports team, a school, or an online community you already belong to. Write what the place needs and how your ability would meet that need. You do not have to act on any of these yet. The point is to see the links.</w:t>
+      </w:r>
+    </w:p>
+    <w:p>
+      <w:pPr>
+        <w:pStyle w:val="BodyText"/>
+      </w:pPr>
+      <w:r>
+        <w:rPr>
+          <w:bCs/>
+          <w:b/>
+        </w:rPr>
+        <w:t xml:space="preserve">Your answer:</w:t>
+      </w:r>
+    </w:p>
+    <w:p>
+      <w:pPr>
+        <w:pStyle w:val="BodyText"/>
+      </w:pPr>
+      <w:r>
+        <w:t xml:space="preserve">________________________________________</w:t>
+      </w:r>
+    </w:p>
+    <w:p>
+      <w:pPr>
+        <w:pStyle w:val="BodyText"/>
+      </w:pPr>
+      <w:r>
+        <w:t xml:space="preserve">________________________________________</w:t>
+      </w:r>
+    </w:p>
+    <w:p>
+      <w:pPr>
+        <w:pStyle w:val="BodyText"/>
+      </w:pPr>
+      <w:r>
+        <w:t xml:space="preserve">________________________________________</w:t>
       </w:r>
     </w:p>
     <w:bookmarkEnd w:id="34"/>
@@ -883,7 +1206,43 @@
         <w:pStyle w:val="FirstParagraph"/>
       </w:pPr>
       <w:r>
-        <w:t xml:space="preserve">Look back at your full list. Choose the single ability that you are proudest of, the one you would most like other people to recognise in you. Write a short paragraph about a time you used it well, outside of any job title. Then write one sentence about how you would like to use it over the next year. Keep this paragraph. You will refer to it in the final chapter when you write your plan.</w:t>
+        <w:t xml:space="preserve">Look back at your full list. Choose the single ability that you are proudest of, the one you would most like other people to recognize in you. Write a short paragraph about a time you used it well, outside of any job title. Then write one sentence about how you would like to use it over the next year. Keep this paragraph. You will refer to it in the final chapter when you write your plan.</w:t>
+      </w:r>
+    </w:p>
+    <w:p>
+      <w:pPr>
+        <w:pStyle w:val="BodyText"/>
+      </w:pPr>
+      <w:r>
+        <w:rPr>
+          <w:bCs/>
+          <w:b/>
+        </w:rPr>
+        <w:t xml:space="preserve">Your answer:</w:t>
+      </w:r>
+    </w:p>
+    <w:p>
+      <w:pPr>
+        <w:pStyle w:val="BodyText"/>
+      </w:pPr>
+      <w:r>
+        <w:t xml:space="preserve">________________________________________</w:t>
+      </w:r>
+    </w:p>
+    <w:p>
+      <w:pPr>
+        <w:pStyle w:val="BodyText"/>
+      </w:pPr>
+      <w:r>
+        <w:t xml:space="preserve">________________________________________</w:t>
+      </w:r>
+    </w:p>
+    <w:p>
+      <w:pPr>
+        <w:pStyle w:val="BodyText"/>
+      </w:pPr>
+      <w:r>
+        <w:t xml:space="preserve">________________________________________</w:t>
       </w:r>
     </w:p>
     <w:bookmarkEnd w:id="35"/>
@@ -1001,7 +1360,7 @@
         <w:t xml:space="preserve">“</w:t>
       </w:r>
       <w:r>
-        <w:t xml:space="preserve">Anna. Rang her on Monday, she was delighted. We walked for two hours, talked about the old team, then about her sister’s wedding, then about nothing. I came home lighter than I have felt in months. I want to do this every fortnight. I want to make it a standing thing so I do not have to decide each time.</w:t>
+        <w:t xml:space="preserve">Laura. Rang her on Monday, she was delighted. We walked for two hours, talked about the old team, then about her sister’s wedding, then about nothing. I came home lighter than I have felt in months. I want to do this every two weeks. I want to make it a standing thing so I do not have to decide each time.</w:t>
       </w:r>
       <w:r>
         <w:t xml:space="preserve">”</w:t>
@@ -1037,7 +1396,43 @@
         <w:pStyle w:val="FirstParagraph"/>
       </w:pPr>
       <w:r>
-        <w:t xml:space="preserve">Draw three rings on a page. Place yourself in the centre. In the inner ring, write the names of the people you are closest to and see most often. In the middle ring, write those you like and would like to see more often, but do not currently see. In the outer ring, write the people you know through activities, neighbourhood life or past work, who you might like to know better. Do not judge the names. Just place them where they belong.</w:t>
+        <w:t xml:space="preserve">Draw three rings on a page. Place yourself in the center. In the inner ring, write the names of the people you are closest to and see most often. In the middle ring, write those you like and would like to see more often, but do not currently see. In the outer ring, write the people you know through activities, neighborhood life or past work, who you might like to know better. Do not judge the names. Just place them where they belong.</w:t>
+      </w:r>
+    </w:p>
+    <w:p>
+      <w:pPr>
+        <w:pStyle w:val="BodyText"/>
+      </w:pPr>
+      <w:r>
+        <w:rPr>
+          <w:bCs/>
+          <w:b/>
+        </w:rPr>
+        <w:t xml:space="preserve">Your answer:</w:t>
+      </w:r>
+    </w:p>
+    <w:p>
+      <w:pPr>
+        <w:pStyle w:val="BodyText"/>
+      </w:pPr>
+      <w:r>
+        <w:t xml:space="preserve">________________________________________</w:t>
+      </w:r>
+    </w:p>
+    <w:p>
+      <w:pPr>
+        <w:pStyle w:val="BodyText"/>
+      </w:pPr>
+      <w:r>
+        <w:t xml:space="preserve">________________________________________</w:t>
+      </w:r>
+    </w:p>
+    <w:p>
+      <w:pPr>
+        <w:pStyle w:val="BodyText"/>
+      </w:pPr>
+      <w:r>
+        <w:t xml:space="preserve">________________________________________</w:t>
       </w:r>
     </w:p>
     <w:bookmarkEnd w:id="38"/>
@@ -1058,6 +1453,42 @@
         <w:t xml:space="preserve">Look at your map and think about the last time you spent time with each person in the inner and middle rings. Next to each name, write one word that describes how you felt afterwards: lighter, tired, understood, bored, restored or uneasy. Notice any patterns. Which relationships leave you feeling more like yourself? Which ones take more than they give? Write one sentence about what you would like to change.</w:t>
       </w:r>
     </w:p>
+    <w:p>
+      <w:pPr>
+        <w:pStyle w:val="BodyText"/>
+      </w:pPr>
+      <w:r>
+        <w:rPr>
+          <w:bCs/>
+          <w:b/>
+        </w:rPr>
+        <w:t xml:space="preserve">Your answer:</w:t>
+      </w:r>
+    </w:p>
+    <w:p>
+      <w:pPr>
+        <w:pStyle w:val="BodyText"/>
+      </w:pPr>
+      <w:r>
+        <w:t xml:space="preserve">________________________________________</w:t>
+      </w:r>
+    </w:p>
+    <w:p>
+      <w:pPr>
+        <w:pStyle w:val="BodyText"/>
+      </w:pPr>
+      <w:r>
+        <w:t xml:space="preserve">________________________________________</w:t>
+      </w:r>
+    </w:p>
+    <w:p>
+      <w:pPr>
+        <w:pStyle w:val="BodyText"/>
+      </w:pPr>
+      <w:r>
+        <w:t xml:space="preserve">________________________________________</w:t>
+      </w:r>
+    </w:p>
     <w:bookmarkEnd w:id="39"/>
     <w:bookmarkStart w:id="40" w:name="day-12-make-one-invitation"/>
     <w:p>
@@ -1073,7 +1504,43 @@
         <w:pStyle w:val="FirstParagraph"/>
       </w:pPr>
       <w:r>
-        <w:t xml:space="preserve">Choose one person from the middle ring. Write a short message inviting them to do something specific within the next two weeks. Keep it simple: a walk, a coffee, a visit to a market or an exhibition. Send the message today, or write it on a card and post it tomorrow. Afterwards, write down how it felt to make the invitation, whatever the reply. The step is the work for today, and you can judge it by taking it, not by how it turns out.</w:t>
+        <w:t xml:space="preserve">Choose one person from the middle ring. Write a short message inviting them to do something specific within the next two weeks. Keep it simple: a walk, a coffee, a visit to a market or an exhibition. Send the message today, or write it on a card and mail it tomorrow. Afterwards, write down how it felt to make the invitation, whatever the reply. The step is the work for today, and you can judge it by taking it, not by how it turns out.</w:t>
+      </w:r>
+    </w:p>
+    <w:p>
+      <w:pPr>
+        <w:pStyle w:val="BodyText"/>
+      </w:pPr>
+      <w:r>
+        <w:rPr>
+          <w:bCs/>
+          <w:b/>
+        </w:rPr>
+        <w:t xml:space="preserve">Your answer:</w:t>
+      </w:r>
+    </w:p>
+    <w:p>
+      <w:pPr>
+        <w:pStyle w:val="BodyText"/>
+      </w:pPr>
+      <w:r>
+        <w:t xml:space="preserve">________________________________________</w:t>
+      </w:r>
+    </w:p>
+    <w:p>
+      <w:pPr>
+        <w:pStyle w:val="BodyText"/>
+      </w:pPr>
+      <w:r>
+        <w:t xml:space="preserve">________________________________________</w:t>
+      </w:r>
+    </w:p>
+    <w:p>
+      <w:pPr>
+        <w:pStyle w:val="BodyText"/>
+      </w:pPr>
+      <w:r>
+        <w:t xml:space="preserve">________________________________________</w:t>
       </w:r>
     </w:p>
     <w:bookmarkEnd w:id="40"/>
@@ -1165,7 +1632,7 @@
         <w:pStyle w:val="BodyText"/>
       </w:pPr>
       <w:r>
-        <w:t xml:space="preserve">Most adults have interests they dropped in the busy years. Some were practical, such as drawing, learning a language or a musical instrument. Others were social or physical, such as dancing, rambling, or playing a team sport on weekends. Some were simply private pleasures, like reading a particular kind of history, or walking in a certain part of town. The busy years were not wrong to set them aside. But the interests are still there, and they may fit the life you have now better than they did before.</w:t>
+        <w:t xml:space="preserve">Most adults have interests they dropped in the busy years. Some were practical, such as drawing, learning a language or a musical instrument. Others were social or physical, such as dancing, hiking, or playing a team sport on weekends. Some were simply private pleasures, like reading a particular kind of history, or walking in a certain part of town. The busy years were not wrong to set them aside. But the interests are still there, and they may fit the life you have now better than they did before.</w:t>
       </w:r>
     </w:p>
     <w:p>
@@ -1243,6 +1710,42 @@
       </w:pPr>
       <w:r>
         <w:t xml:space="preserve">Write a list of every interest, hobby or pursuit that you enjoyed before the age of forty, and then again between forty and retirement. Include things you were good at and things you only liked. Do not judge them, and do not worry if some seem silly now. When your list is complete, circle the three you think you would most enjoy returning to, even slightly.</w:t>
+      </w:r>
+    </w:p>
+    <w:p>
+      <w:pPr>
+        <w:pStyle w:val="BodyText"/>
+      </w:pPr>
+      <w:r>
+        <w:rPr>
+          <w:bCs/>
+          <w:b/>
+        </w:rPr>
+        <w:t xml:space="preserve">Your answer:</w:t>
+      </w:r>
+    </w:p>
+    <w:p>
+      <w:pPr>
+        <w:pStyle w:val="BodyText"/>
+      </w:pPr>
+      <w:r>
+        <w:t xml:space="preserve">________________________________________</w:t>
+      </w:r>
+    </w:p>
+    <w:p>
+      <w:pPr>
+        <w:pStyle w:val="BodyText"/>
+      </w:pPr>
+      <w:r>
+        <w:t xml:space="preserve">________________________________________</w:t>
+      </w:r>
+    </w:p>
+    <w:p>
+      <w:pPr>
+        <w:pStyle w:val="BodyText"/>
+      </w:pPr>
+      <w:r>
+        <w:t xml:space="preserve">________________________________________</w:t>
       </w:r>
     </w:p>
     <w:bookmarkEnd w:id="43"/>
@@ -1263,6 +1766,42 @@
         <w:t xml:space="preserve">Choose one of the three circled interests and spend fifteen minutes on it today. You might read a few pages about it, look at pictures, watch a short video, or take out the equipment and try it for a few minutes. Write down what you did, and then answer three questions in your notebook. What did you enjoy about it? What felt awkward? What did you want to know more about?</w:t>
       </w:r>
     </w:p>
+    <w:p>
+      <w:pPr>
+        <w:pStyle w:val="BodyText"/>
+      </w:pPr>
+      <w:r>
+        <w:rPr>
+          <w:bCs/>
+          <w:b/>
+        </w:rPr>
+        <w:t xml:space="preserve">Your answer:</w:t>
+      </w:r>
+    </w:p>
+    <w:p>
+      <w:pPr>
+        <w:pStyle w:val="BodyText"/>
+      </w:pPr>
+      <w:r>
+        <w:t xml:space="preserve">________________________________________</w:t>
+      </w:r>
+    </w:p>
+    <w:p>
+      <w:pPr>
+        <w:pStyle w:val="BodyText"/>
+      </w:pPr>
+      <w:r>
+        <w:t xml:space="preserve">________________________________________</w:t>
+      </w:r>
+    </w:p>
+    <w:p>
+      <w:pPr>
+        <w:pStyle w:val="BodyText"/>
+      </w:pPr>
+      <w:r>
+        <w:t xml:space="preserve">________________________________________</w:t>
+      </w:r>
+    </w:p>
     <w:bookmarkEnd w:id="44"/>
     <w:bookmarkStart w:id="45" w:name="day-15-the-question-you-would-ask"/>
     <w:p>
@@ -1281,6 +1820,42 @@
         <w:t xml:space="preserve">Imagine a stranger who shares your interest in the thing you revisited yesterday. Write down the question you would most like to ask them, and the answer you would hope to hear. Then write one practical way you could find that answer, such as a book, a class, a local club or a conversation with someone who has done it. This small exercise turns curiosity into a plan you can follow, one step at a time.</w:t>
       </w:r>
     </w:p>
+    <w:p>
+      <w:pPr>
+        <w:pStyle w:val="BodyText"/>
+      </w:pPr>
+      <w:r>
+        <w:rPr>
+          <w:bCs/>
+          <w:b/>
+        </w:rPr>
+        <w:t xml:space="preserve">Your answer:</w:t>
+      </w:r>
+    </w:p>
+    <w:p>
+      <w:pPr>
+        <w:pStyle w:val="BodyText"/>
+      </w:pPr>
+      <w:r>
+        <w:t xml:space="preserve">________________________________________</w:t>
+      </w:r>
+    </w:p>
+    <w:p>
+      <w:pPr>
+        <w:pStyle w:val="BodyText"/>
+      </w:pPr>
+      <w:r>
+        <w:t xml:space="preserve">________________________________________</w:t>
+      </w:r>
+    </w:p>
+    <w:p>
+      <w:pPr>
+        <w:pStyle w:val="BodyText"/>
+      </w:pPr>
+      <w:r>
+        <w:t xml:space="preserve">________________________________________</w:t>
+      </w:r>
+    </w:p>
     <w:bookmarkEnd w:id="45"/>
     <w:bookmarkStart w:id="46" w:name="X2543c801d2433ba2daf9f8df8e3a6a27cda69fd"/>
     <w:p>
@@ -1296,7 +1871,7 @@
         <w:pStyle w:val="FirstParagraph"/>
       </w:pPr>
       <w:r>
-        <w:t xml:space="preserve">A hobby that you return to every week becomes a habit, and a habit can shape the rest of your life in useful ways. People who have lapsed interests often find that the first few sessions are rough. They are slow, unpractised and sometimes frustrating. The pleasure arrives later, once the body and mind remember the rhythm of the activity. That is one reason why the two-week trials in Chapter 6 are so useful: they give you enough time to get past the rough beginning.</w:t>
+        <w:t xml:space="preserve">A hobby that you return to every week becomes a habit, and a habit can shape the rest of your life in useful ways. People who have lapsed interests often find that the first few sessions are rough. They are slow, unpracticed and sometimes frustrating. The pleasure arrives later, once the body and mind remember the rhythm of the activity. That is one reason why the two-week trials in Chapter 6 are so useful: they give you enough time to get past the rough beginning.</w:t>
       </w:r>
     </w:p>
     <w:p>
@@ -1391,7 +1966,7 @@
         <w:pStyle w:val="BodyText"/>
       </w:pPr>
       <w:r>
-        <w:t xml:space="preserve">Trials also have a useful side effect. Once you have tried something and stopped, you have data. You know that a particular kind of activity is not for you, and that is valuable information. Many people are relieved when they realise they can change their minds.</w:t>
+        <w:t xml:space="preserve">Trials also have a useful side effect. Once you have tried something and stopped, you have data. You know that a particular kind of activity is not for you, and that is valuable information. Many people are relieved when they realize they can change their minds.</w:t>
       </w:r>
     </w:p>
     <w:p>
@@ -1434,7 +2009,7 @@
         <w:t xml:space="preserve">“</w:t>
       </w:r>
       <w:r>
-        <w:t xml:space="preserve">Would I like to try this for a fortnight?</w:t>
+        <w:t xml:space="preserve">Would I like to try this for two weeks?</w:t>
       </w:r>
       <w:r>
         <w:t xml:space="preserve">”</w:t>
@@ -1502,6 +2077,42 @@
       </w:pPr>
       <w:r>
         <w:t xml:space="preserve">Write a list of ten small activities you could try in the next few months. Include a mix of things: learning, physical activity, social events and creative work. Examples might include a short class, a choir, a garden plot, a book club, a volunteer shift, a museum’s lecture series or a weekend workshop. Keep each one small and easy to start. Next to each, write how much time and money it would need, in general terms.</w:t>
+      </w:r>
+    </w:p>
+    <w:p>
+      <w:pPr>
+        <w:pStyle w:val="BodyText"/>
+      </w:pPr>
+      <w:r>
+        <w:rPr>
+          <w:bCs/>
+          <w:b/>
+        </w:rPr>
+        <w:t xml:space="preserve">Your answer:</w:t>
+      </w:r>
+    </w:p>
+    <w:p>
+      <w:pPr>
+        <w:pStyle w:val="BodyText"/>
+      </w:pPr>
+      <w:r>
+        <w:t xml:space="preserve">________________________________________</w:t>
+      </w:r>
+    </w:p>
+    <w:p>
+      <w:pPr>
+        <w:pStyle w:val="BodyText"/>
+      </w:pPr>
+      <w:r>
+        <w:t xml:space="preserve">________________________________________</w:t>
+      </w:r>
+    </w:p>
+    <w:p>
+      <w:pPr>
+        <w:pStyle w:val="BodyText"/>
+      </w:pPr>
+      <w:r>
+        <w:t xml:space="preserve">________________________________________</w:t>
       </w:r>
     </w:p>
     <w:bookmarkEnd w:id="48"/>
@@ -1522,6 +2133,42 @@
         <w:t xml:space="preserve">Choose the activity from your menu that you feel most curious about, not the one you think you should do. Find out when it next runs, or how to join. Then put the first session in your calendar, and set a reminder to attend it. Write down the date you will start and the date you will review it, which should be fourteen days later. Write one sentence explaining why you chose this trial.</w:t>
       </w:r>
     </w:p>
+    <w:p>
+      <w:pPr>
+        <w:pStyle w:val="BodyText"/>
+      </w:pPr>
+      <w:r>
+        <w:rPr>
+          <w:bCs/>
+          <w:b/>
+        </w:rPr>
+        <w:t xml:space="preserve">Your answer:</w:t>
+      </w:r>
+    </w:p>
+    <w:p>
+      <w:pPr>
+        <w:pStyle w:val="BodyText"/>
+      </w:pPr>
+      <w:r>
+        <w:t xml:space="preserve">________________________________________</w:t>
+      </w:r>
+    </w:p>
+    <w:p>
+      <w:pPr>
+        <w:pStyle w:val="BodyText"/>
+      </w:pPr>
+      <w:r>
+        <w:t xml:space="preserve">________________________________________</w:t>
+      </w:r>
+    </w:p>
+    <w:p>
+      <w:pPr>
+        <w:pStyle w:val="BodyText"/>
+      </w:pPr>
+      <w:r>
+        <w:t xml:space="preserve">________________________________________</w:t>
+      </w:r>
+    </w:p>
     <w:bookmarkEnd w:id="49"/>
     <w:bookmarkStart w:id="50" w:name="day-18-review-the-trial"/>
     <w:p>
@@ -1538,6 +2185,42 @@
       </w:pPr>
       <w:r>
         <w:t xml:space="preserve">Set aside time at the end of your two-week trial, or at the end of the first week if the activity is weekly. Write a short review with four headings: what I did, what I enjoyed, what I did not enjoy, and what I want to do next. Be honest about the answer to the last question. If you want to continue, plan the next step. If you want to stop, write down what you learned and choose the next trial from your menu.</w:t>
+      </w:r>
+    </w:p>
+    <w:p>
+      <w:pPr>
+        <w:pStyle w:val="BodyText"/>
+      </w:pPr>
+      <w:r>
+        <w:rPr>
+          <w:bCs/>
+          <w:b/>
+        </w:rPr>
+        <w:t xml:space="preserve">Your answer:</w:t>
+      </w:r>
+    </w:p>
+    <w:p>
+      <w:pPr>
+        <w:pStyle w:val="BodyText"/>
+      </w:pPr>
+      <w:r>
+        <w:t xml:space="preserve">________________________________________</w:t>
+      </w:r>
+    </w:p>
+    <w:p>
+      <w:pPr>
+        <w:pStyle w:val="BodyText"/>
+      </w:pPr>
+      <w:r>
+        <w:t xml:space="preserve">________________________________________</w:t>
+      </w:r>
+    </w:p>
+    <w:p>
+      <w:pPr>
+        <w:pStyle w:val="BodyText"/>
+      </w:pPr>
+      <w:r>
+        <w:t xml:space="preserve">________________________________________</w:t>
       </w:r>
     </w:p>
     <w:bookmarkEnd w:id="50"/>
@@ -1590,7 +2273,7 @@
         <w:pStyle w:val="FirstParagraph"/>
       </w:pPr>
       <w:r>
-        <w:t xml:space="preserve">Gregory had always been an organised man. He kept a diary, planned his holidays months in advance and disliked surprises. When he retired, he assumed that his planning skills would make the transition easy. Instead, he found himself putting things off. He would open the list of volunteering opportunities, read it, close the laptop and make a cup of tea. He could not explain the reluctance, and it made him uncomfortable.</w:t>
+        <w:t xml:space="preserve">Gregory had always been an organized man. He kept a diary, planned his holidays months in advance and disliked surprises. When he retired, he assumed that his planning skills would make the transition easy. Instead, he found himself putting things off. He would open the list of volunteering opportunities, read it, close the laptop and make a cup of tea. He could not explain the reluctance, and it made him uncomfortable.</w:t>
       </w:r>
     </w:p>
     <w:p>
@@ -1606,15 +2289,15 @@
         <w:pStyle w:val="BodyText"/>
       </w:pPr>
       <w:r>
-        <w:t xml:space="preserve">This is not a chapter about diagnosing anything. If a feeling of this kind persists, makes daily life difficult, or lingers for many weeks, it is a good idea to speak to a doctor or a counsellor. This workbook is not a substitute for that help. But many people find it useful to write down the small obstacles they meet in everyday life, and to look at them calmly. Naming a friction does not make it disappear. It does make it easier to see what you are actually dealing with, and to decide what to do next.</w:t>
-      </w:r>
-    </w:p>
-    <w:p>
-      <w:pPr>
-        <w:pStyle w:val="BodyText"/>
-      </w:pPr>
-      <w:r>
-        <w:t xml:space="preserve">Frictions come in many forms. Some are practical: no transport, no free afternoons, no space in the house. Some are about other people: a partner who expects you to be available, or a friend who questions your choices. Some are about habits, such as sleeping late, watching the same programmes, or avoiding a phone call. And some are about the stories we tell ourselves, such as</w:t>
+        <w:t xml:space="preserve">This is not a chapter about diagnosing anything. If a feeling of this kind persists, makes daily life difficult, or lingers for many weeks, it is a good idea to speak to a doctor or a counselor. This workbook is not a substitute for that help. But many people find it useful to write down the small obstacles they meet in everyday life, and to look at them calmly. Naming a friction does not make it disappear. It does make it easier to see what you are actually dealing with, and to decide what to do next.</w:t>
+      </w:r>
+    </w:p>
+    <w:p>
+      <w:pPr>
+        <w:pStyle w:val="BodyText"/>
+      </w:pPr>
+      <w:r>
+        <w:t xml:space="preserve">Frictions come in many forms. Some are practical: no transport, no free afternoons, no space in the house. Some are about other people: a partner who expects you to be available, or a friend who questions your choices. Some are about habits, such as sleeping late, watching the same programs, or avoiding a phone call. And some are about the stories we tell ourselves, such as</w:t>
       </w:r>
       <w:r>
         <w:t xml:space="preserve"> </w:t>
@@ -1702,7 +2385,7 @@
         <w:pStyle w:val="BodyText"/>
       </w:pPr>
       <w:r>
-        <w:t xml:space="preserve">If a friction stays heavy for many weeks, or if it affects your sleep, appetite, mood or daily functioning, it is worth talking to a doctor or a counsellor. Writing about it is a useful habit, but it is not a replacement for that kind of support.</w:t>
+        <w:t xml:space="preserve">If a friction stays heavy for many weeks, or if it affects your sleep, appetite, mood or daily functioning, it is worth talking to a doctor or a counselor. Writing about it is a useful habit, but it is not a replacement for that kind of support.</w:t>
       </w:r>
     </w:p>
     <w:bookmarkStart w:id="53" w:name="day-19-list-the-small-obstacles"/>
@@ -1720,6 +2403,42 @@
       </w:pPr>
       <w:r>
         <w:t xml:space="preserve">Write down every obstacle you have noticed when you think about starting something new. Include practical problems, people problems, habits and thoughts. Write each one in a single sentence. Do not try to solve any of them yet. When the list is complete, put a small tick next to the three that appear most often or feel heaviest.</w:t>
+      </w:r>
+    </w:p>
+    <w:p>
+      <w:pPr>
+        <w:pStyle w:val="BodyText"/>
+      </w:pPr>
+      <w:r>
+        <w:rPr>
+          <w:bCs/>
+          <w:b/>
+        </w:rPr>
+        <w:t xml:space="preserve">Your answer:</w:t>
+      </w:r>
+    </w:p>
+    <w:p>
+      <w:pPr>
+        <w:pStyle w:val="BodyText"/>
+      </w:pPr>
+      <w:r>
+        <w:t xml:space="preserve">________________________________________</w:t>
+      </w:r>
+    </w:p>
+    <w:p>
+      <w:pPr>
+        <w:pStyle w:val="BodyText"/>
+      </w:pPr>
+      <w:r>
+        <w:t xml:space="preserve">________________________________________</w:t>
+      </w:r>
+    </w:p>
+    <w:p>
+      <w:pPr>
+        <w:pStyle w:val="BodyText"/>
+      </w:pPr>
+      <w:r>
+        <w:t xml:space="preserve">________________________________________</w:t>
       </w:r>
     </w:p>
     <w:bookmarkEnd w:id="53"/>
@@ -1740,6 +2459,42 @@
         <w:t xml:space="preserve">Choose one of the thoughts you ticked yesterday. Write it at the top of a page. Underneath, draw two columns. In the left column, list the facts that support the thought. In the right column, list the facts that do not support it, or that might point to a different conclusion. Read both columns back and write one sentence that describes what you can truthfully say now. Keep it modest and true.</w:t>
       </w:r>
     </w:p>
+    <w:p>
+      <w:pPr>
+        <w:pStyle w:val="BodyText"/>
+      </w:pPr>
+      <w:r>
+        <w:rPr>
+          <w:bCs/>
+          <w:b/>
+        </w:rPr>
+        <w:t xml:space="preserve">Your answer:</w:t>
+      </w:r>
+    </w:p>
+    <w:p>
+      <w:pPr>
+        <w:pStyle w:val="BodyText"/>
+      </w:pPr>
+      <w:r>
+        <w:t xml:space="preserve">________________________________________</w:t>
+      </w:r>
+    </w:p>
+    <w:p>
+      <w:pPr>
+        <w:pStyle w:val="BodyText"/>
+      </w:pPr>
+      <w:r>
+        <w:t xml:space="preserve">________________________________________</w:t>
+      </w:r>
+    </w:p>
+    <w:p>
+      <w:pPr>
+        <w:pStyle w:val="BodyText"/>
+      </w:pPr>
+      <w:r>
+        <w:t xml:space="preserve">________________________________________</w:t>
+      </w:r>
+    </w:p>
     <w:bookmarkEnd w:id="54"/>
     <w:bookmarkStart w:id="55" w:name="X40755b6898ee5e45f172e386f85e65a6e990aae"/>
     <w:p>
@@ -1756,6 +2511,42 @@
       </w:pPr>
       <w:r>
         <w:t xml:space="preserve">Pick one practical obstacle from your list. Write down one small change you could make this week that would reduce its weight. For example, you might ask a friend to come with you to a first meeting, look up bus times the night before, or set aside one free hour a week for something new. Write the change, the day you will try it, and how you will know whether it helped.</w:t>
+      </w:r>
+    </w:p>
+    <w:p>
+      <w:pPr>
+        <w:pStyle w:val="BodyText"/>
+      </w:pPr>
+      <w:r>
+        <w:rPr>
+          <w:bCs/>
+          <w:b/>
+        </w:rPr>
+        <w:t xml:space="preserve">Your answer:</w:t>
+      </w:r>
+    </w:p>
+    <w:p>
+      <w:pPr>
+        <w:pStyle w:val="BodyText"/>
+      </w:pPr>
+      <w:r>
+        <w:t xml:space="preserve">________________________________________</w:t>
+      </w:r>
+    </w:p>
+    <w:p>
+      <w:pPr>
+        <w:pStyle w:val="BodyText"/>
+      </w:pPr>
+      <w:r>
+        <w:t xml:space="preserve">________________________________________</w:t>
+      </w:r>
+    </w:p>
+    <w:p>
+      <w:pPr>
+        <w:pStyle w:val="BodyText"/>
+      </w:pPr>
+      <w:r>
+        <w:t xml:space="preserve">________________________________________</w:t>
       </w:r>
     </w:p>
     <w:bookmarkEnd w:id="55"/>
@@ -1967,6 +2758,42 @@
         <w:t xml:space="preserve">Write down the activities that you would like to happen every week. Include things you need to do, things you enjoy, and things that connect you to other people. Choose no more than four. Then, next to each one, write the day or time that would suit it best. Consider your energy as well as your diary. A morning walk may suit you better than an evening class if you tire by seven.</w:t>
       </w:r>
     </w:p>
+    <w:p>
+      <w:pPr>
+        <w:pStyle w:val="BodyText"/>
+      </w:pPr>
+      <w:r>
+        <w:rPr>
+          <w:bCs/>
+          <w:b/>
+        </w:rPr>
+        <w:t xml:space="preserve">Your answer:</w:t>
+      </w:r>
+    </w:p>
+    <w:p>
+      <w:pPr>
+        <w:pStyle w:val="BodyText"/>
+      </w:pPr>
+      <w:r>
+        <w:t xml:space="preserve">________________________________________</w:t>
+      </w:r>
+    </w:p>
+    <w:p>
+      <w:pPr>
+        <w:pStyle w:val="BodyText"/>
+      </w:pPr>
+      <w:r>
+        <w:t xml:space="preserve">________________________________________</w:t>
+      </w:r>
+    </w:p>
+    <w:p>
+      <w:pPr>
+        <w:pStyle w:val="BodyText"/>
+      </w:pPr>
+      <w:r>
+        <w:t xml:space="preserve">________________________________________</w:t>
+      </w:r>
+    </w:p>
     <w:bookmarkEnd w:id="58"/>
     <w:bookmarkStart w:id="59" w:name="day-23-draw-your-week"/>
     <w:p>
@@ -1982,7 +2809,43 @@
         <w:pStyle w:val="FirstParagraph"/>
       </w:pPr>
       <w:r>
-        <w:t xml:space="preserve">Draw a simple grid of seven columns, one for each day, with rows for morning, afternoon and evening. Place your anchors on the grid first. Then, in a different colour or with a different mark, shade the blocks you would like to keep free. Look at the result. Is there enough space in the week to rest? Is there at least one block that is free for spontaneity? Adjust until the grid feels both supportive and open.</w:t>
+        <w:t xml:space="preserve">Draw a simple grid of seven columns, one for each day, with rows for morning, afternoon and evening. Place your anchors on the grid first. Then, in a different color or with a different mark, shade the blocks you would like to keep free. Look at the result. Is there enough space in the week to rest? Is there at least one block that is free for spontaneity? Adjust until the grid feels both supportive and open.</w:t>
+      </w:r>
+    </w:p>
+    <w:p>
+      <w:pPr>
+        <w:pStyle w:val="BodyText"/>
+      </w:pPr>
+      <w:r>
+        <w:rPr>
+          <w:bCs/>
+          <w:b/>
+        </w:rPr>
+        <w:t xml:space="preserve">Your answer:</w:t>
+      </w:r>
+    </w:p>
+    <w:p>
+      <w:pPr>
+        <w:pStyle w:val="BodyText"/>
+      </w:pPr>
+      <w:r>
+        <w:t xml:space="preserve">________________________________________</w:t>
+      </w:r>
+    </w:p>
+    <w:p>
+      <w:pPr>
+        <w:pStyle w:val="BodyText"/>
+      </w:pPr>
+      <w:r>
+        <w:t xml:space="preserve">________________________________________</w:t>
+      </w:r>
+    </w:p>
+    <w:p>
+      <w:pPr>
+        <w:pStyle w:val="BodyText"/>
+      </w:pPr>
+      <w:r>
+        <w:t xml:space="preserve">________________________________________</w:t>
       </w:r>
     </w:p>
     <w:bookmarkEnd w:id="59"/>
@@ -2001,6 +2864,42 @@
       </w:pPr>
       <w:r>
         <w:t xml:space="preserve">Every rhythm needs a plan for the days when it falls apart, because it will. Write down three things you could do on a low-energy day that would still count as a good day. They might be short: a short walk, a phone call to someone you like, one chapter of a book, or a shower and fresh clothes. Keep this list where you can see it. It is for the days when the rhythm does not feel possible.</w:t>
+      </w:r>
+    </w:p>
+    <w:p>
+      <w:pPr>
+        <w:pStyle w:val="BodyText"/>
+      </w:pPr>
+      <w:r>
+        <w:rPr>
+          <w:bCs/>
+          <w:b/>
+        </w:rPr>
+        <w:t xml:space="preserve">Your answer:</w:t>
+      </w:r>
+    </w:p>
+    <w:p>
+      <w:pPr>
+        <w:pStyle w:val="BodyText"/>
+      </w:pPr>
+      <w:r>
+        <w:t xml:space="preserve">________________________________________</w:t>
+      </w:r>
+    </w:p>
+    <w:p>
+      <w:pPr>
+        <w:pStyle w:val="BodyText"/>
+      </w:pPr>
+      <w:r>
+        <w:t xml:space="preserve">________________________________________</w:t>
+      </w:r>
+    </w:p>
+    <w:p>
+      <w:pPr>
+        <w:pStyle w:val="BodyText"/>
+      </w:pPr>
+      <w:r>
+        <w:t xml:space="preserve">________________________________________</w:t>
       </w:r>
     </w:p>
     <w:bookmarkEnd w:id="60"/>
@@ -2053,15 +2952,15 @@
         <w:pStyle w:val="FirstParagraph"/>
       </w:pPr>
       <w:r>
-        <w:t xml:space="preserve">Desmond had agreed to help with almost everything. His former colleagues asked him to advise on projects, his daughter asked him to look after her children twice a week, his church needed someone to run the coffee morning, and a neighbour wanted help with a leaking garden shed. Each request was reasonable. Together they filled his week, and he began to feel resentful, though he could not say who he was resentful of.</w:t>
-      </w:r>
-    </w:p>
-    <w:p>
-      <w:pPr>
-        <w:pStyle w:val="BodyText"/>
-      </w:pPr>
-      <w:r>
-        <w:t xml:space="preserve">The turning point came when he realised that he had said yes to nearly everything because he had not decided what he wanted. He had been reacting to requests rather than choosing. Once he took the time to ask himself what he valued most, the answers were clear. He wanted time with his grandchildren, one regular commitment in his community, and enough rest to enjoy both. He politely declined the advisory work and the coffee morning, and he offered to help with the shed on one Saturday only. The relief was immediate.</w:t>
+        <w:t xml:space="preserve">Desmond had agreed to help with almost everything. His former colleagues asked him to advise on projects, his daughter asked him to look after her children twice a week, his church needed someone to run the coffee morning, and a neighbor wanted help with a leaking garden shed. Each request was reasonable. Together they filled his week, and he began to feel resentful, though he could not say who he was resentful of.</w:t>
+      </w:r>
+    </w:p>
+    <w:p>
+      <w:pPr>
+        <w:pStyle w:val="BodyText"/>
+      </w:pPr>
+      <w:r>
+        <w:t xml:space="preserve">The turning point came when he realized that he had said yes to nearly everything because he had not decided what he wanted. He had been reacting to requests rather than choosing. Once he took the time to ask himself what he valued most, the answers were clear. He wanted time with his grandchildren, one regular commitment in his community, and enough rest to enjoy both. He politely declined the advisory work and the coffee morning, and he offered to help with the shed on one Saturday only. The relief was immediate.</w:t>
       </w:r>
     </w:p>
     <w:p>
@@ -2095,15 +2994,15 @@
         <w:t xml:space="preserve"> </w:t>
       </w:r>
       <w:r>
-        <w:t xml:space="preserve">Saying yes to something new is easier when you have already decided what matters to you. This chapter asks you to look at the requests you receive, to decide what you value, and to practise a few sentences that feel natural.</w:t>
-      </w:r>
-    </w:p>
-    <w:p>
-      <w:pPr>
-        <w:pStyle w:val="BodyText"/>
-      </w:pPr>
-      <w:r>
-        <w:t xml:space="preserve">Saying no is one of the most difficult skills to learn after a working life, especially if your career rewarded helpfulness. Many people who have spent years responding to requests find that the habit continues long after the job has gone. The requests may come from family, friends, former colleagues, neighbours or community groups. Each one seems small, and each one is hard to refuse without a reason.</w:t>
+        <w:t xml:space="preserve">Saying yes to something new is easier when you have already decided what matters to you. This chapter asks you to look at the requests you receive, to decide what you value, and to Practice a few sentences that feel natural.</w:t>
+      </w:r>
+    </w:p>
+    <w:p>
+      <w:pPr>
+        <w:pStyle w:val="BodyText"/>
+      </w:pPr>
+      <w:r>
+        <w:t xml:space="preserve">Saying no is one of the most difficult skills to learn after a working life, especially if your career rewarded helpfulness. Many people who have spent years responding to requests find that the habit continues long after the job has gone. The requests may come from family, friends, former colleagues, neighbors or community groups. Each one seems small, and each one is hard to refuse without a reason.</w:t>
       </w:r>
     </w:p>
     <w:p>
@@ -2165,6 +3064,42 @@
       </w:pPr>
       <w:r>
         <w:t xml:space="preserve">Write down every commitment you have made in the past month, paid or unpaid. Next to each one, write whether you said yes because you wanted to, because you felt you should, or because it was hard to say no. Count the answers in each category. Then write one sentence about what the pattern tells you.</w:t>
+      </w:r>
+    </w:p>
+    <w:p>
+      <w:pPr>
+        <w:pStyle w:val="BodyText"/>
+      </w:pPr>
+      <w:r>
+        <w:rPr>
+          <w:bCs/>
+          <w:b/>
+        </w:rPr>
+        <w:t xml:space="preserve">Your answer:</w:t>
+      </w:r>
+    </w:p>
+    <w:p>
+      <w:pPr>
+        <w:pStyle w:val="BodyText"/>
+      </w:pPr>
+      <w:r>
+        <w:t xml:space="preserve">________________________________________</w:t>
+      </w:r>
+    </w:p>
+    <w:p>
+      <w:pPr>
+        <w:pStyle w:val="BodyText"/>
+      </w:pPr>
+      <w:r>
+        <w:t xml:space="preserve">________________________________________</w:t>
+      </w:r>
+    </w:p>
+    <w:p>
+      <w:pPr>
+        <w:pStyle w:val="BodyText"/>
+      </w:pPr>
+      <w:r>
+        <w:t xml:space="preserve">________________________________________</w:t>
       </w:r>
     </w:p>
     <w:bookmarkEnd w:id="63"/>
@@ -2182,17 +3117,53 @@
         <w:pStyle w:val="FirstParagraph"/>
       </w:pPr>
       <w:r>
-        <w:t xml:space="preserve">Choose three words that describe what matters most to you in the next stage of life. They might be family, learning, health, independence, friendship, service, creativity or peace. Write them at the top of a page. Then, underneath each word, write one example of a commitment that would honour it. Keep this page where you can see it when you are deciding whether to say yes.</w:t>
+        <w:t xml:space="preserve">Choose three words that describe what matters most to you in the next stage of life. They might be family, learning, health, independence, friendship, service, creativity or peace. Write them at the top of a page. Then, underneath each word, write one example of a commitment that would honor it. Keep this page where you can see it when you are deciding whether to say yes.</w:t>
+      </w:r>
+    </w:p>
+    <w:p>
+      <w:pPr>
+        <w:pStyle w:val="BodyText"/>
+      </w:pPr>
+      <w:r>
+        <w:rPr>
+          <w:bCs/>
+          <w:b/>
+        </w:rPr>
+        <w:t xml:space="preserve">Your answer:</w:t>
+      </w:r>
+    </w:p>
+    <w:p>
+      <w:pPr>
+        <w:pStyle w:val="BodyText"/>
+      </w:pPr>
+      <w:r>
+        <w:t xml:space="preserve">________________________________________</w:t>
+      </w:r>
+    </w:p>
+    <w:p>
+      <w:pPr>
+        <w:pStyle w:val="BodyText"/>
+      </w:pPr>
+      <w:r>
+        <w:t xml:space="preserve">________________________________________</w:t>
+      </w:r>
+    </w:p>
+    <w:p>
+      <w:pPr>
+        <w:pStyle w:val="BodyText"/>
+      </w:pPr>
+      <w:r>
+        <w:t xml:space="preserve">________________________________________</w:t>
       </w:r>
     </w:p>
     <w:bookmarkEnd w:id="64"/>
-    <w:bookmarkStart w:id="65" w:name="day-27-practise-two-sentences"/>
+    <w:bookmarkStart w:id="65" w:name="day-27-practice-two-sentences"/>
     <w:p>
       <w:pPr>
         <w:pStyle w:val="Heading3"/>
       </w:pPr>
       <w:r>
-        <w:t xml:space="preserve">Day 27: Practise Two Sentences</w:t>
+        <w:t xml:space="preserve">Day 27: Practice Two Sentences</w:t>
       </w:r>
     </w:p>
     <w:p>
@@ -2236,7 +3207,43 @@
         <w:t xml:space="preserve"> </w:t>
       </w:r>
       <w:r>
-        <w:t xml:space="preserve">Say them out loud, in an empty room if you like. Practise until they sound like your own voice.</w:t>
+        <w:t xml:space="preserve">Say them out loud, in an empty room if you like. Practice until they sound like your own voice.</w:t>
+      </w:r>
+    </w:p>
+    <w:p>
+      <w:pPr>
+        <w:pStyle w:val="BodyText"/>
+      </w:pPr>
+      <w:r>
+        <w:rPr>
+          <w:bCs/>
+          <w:b/>
+        </w:rPr>
+        <w:t xml:space="preserve">Your answer:</w:t>
+      </w:r>
+    </w:p>
+    <w:p>
+      <w:pPr>
+        <w:pStyle w:val="BodyText"/>
+      </w:pPr>
+      <w:r>
+        <w:t xml:space="preserve">________________________________________</w:t>
+      </w:r>
+    </w:p>
+    <w:p>
+      <w:pPr>
+        <w:pStyle w:val="BodyText"/>
+      </w:pPr>
+      <w:r>
+        <w:t xml:space="preserve">________________________________________</w:t>
+      </w:r>
+    </w:p>
+    <w:p>
+      <w:pPr>
+        <w:pStyle w:val="BodyText"/>
+      </w:pPr>
+      <w:r>
+        <w:t xml:space="preserve">________________________________________</w:t>
       </w:r>
     </w:p>
     <w:bookmarkEnd w:id="65"/>
@@ -2348,7 +3355,7 @@
         <w:t xml:space="preserve">“</w:t>
       </w:r>
       <w:r>
-        <w:t xml:space="preserve">What I bring: I can explain complicated things calmly, and I want to use that to help people feel less lost. What matters to me: family, learning, and steady friendships. What I will try: a sourdough class at the library by the end of the month, a weekly walk with a neighbour, Sheila, and one volunteer shift at the community garden before the first of the year. Who I will see: my sister every second Thursday, Sheila on Tuesdays, and the old team once a quarter. How I will know it is working: I will look forward to my week and I will have stopped apologising for not being busy.</w:t>
+        <w:t xml:space="preserve">What I bring: I can explain complicated things calmly, and I want to use that to help people feel less lost. What matters to me: family, learning, and steady friendships. What I will try: a watercolor class at the library by the end of the month, a weekly walk with a neighbor, Sheila, and one volunteer shift at the community garden before the first of the year. Who I will see: my sister every second Thursday, Sheila on Tuesdays, and the old team once a quarter. How I will know it is working: I will look forward to my week and I will have stopped apologizing for not being busy.</w:t>
       </w:r>
       <w:r>
         <w:t xml:space="preserve">”</w:t>
@@ -2385,6 +3392,42 @@
       </w:pPr>
       <w:r>
         <w:t xml:space="preserve">Read back over your notes from the whole course. Find the three entries that most clearly describe what you want, what you are good at, and who matters to you. Copy them onto a fresh page. Do not polish them. Simply gather them in one place, so you can see the material you have to work with.</w:t>
+      </w:r>
+    </w:p>
+    <w:p>
+      <w:pPr>
+        <w:pStyle w:val="BodyText"/>
+      </w:pPr>
+      <w:r>
+        <w:rPr>
+          <w:bCs/>
+          <w:b/>
+        </w:rPr>
+        <w:t xml:space="preserve">Your answer:</w:t>
+      </w:r>
+    </w:p>
+    <w:p>
+      <w:pPr>
+        <w:pStyle w:val="BodyText"/>
+      </w:pPr>
+      <w:r>
+        <w:t xml:space="preserve">________________________________________</w:t>
+      </w:r>
+    </w:p>
+    <w:p>
+      <w:pPr>
+        <w:pStyle w:val="BodyText"/>
+      </w:pPr>
+      <w:r>
+        <w:t xml:space="preserve">________________________________________</w:t>
+      </w:r>
+    </w:p>
+    <w:p>
+      <w:pPr>
+        <w:pStyle w:val="BodyText"/>
+      </w:pPr>
+      <w:r>
+        <w:t xml:space="preserve">________________________________________</w:t>
       </w:r>
     </w:p>
     <w:bookmarkEnd w:id="68"/>
@@ -2495,6 +3538,42 @@
         <w:t xml:space="preserve">write one sentence describing what you would notice if the plan were succeeding.</w:t>
       </w:r>
     </w:p>
+    <w:p>
+      <w:pPr>
+        <w:pStyle w:val="BodyText"/>
+      </w:pPr>
+      <w:r>
+        <w:rPr>
+          <w:bCs/>
+          <w:b/>
+        </w:rPr>
+        <w:t xml:space="preserve">Your answer:</w:t>
+      </w:r>
+    </w:p>
+    <w:p>
+      <w:pPr>
+        <w:pStyle w:val="BodyText"/>
+      </w:pPr>
+      <w:r>
+        <w:t xml:space="preserve">________________________________________</w:t>
+      </w:r>
+    </w:p>
+    <w:p>
+      <w:pPr>
+        <w:pStyle w:val="BodyText"/>
+      </w:pPr>
+      <w:r>
+        <w:t xml:space="preserve">________________________________________</w:t>
+      </w:r>
+    </w:p>
+    <w:p>
+      <w:pPr>
+        <w:pStyle w:val="BodyText"/>
+      </w:pPr>
+      <w:r>
+        <w:t xml:space="preserve">________________________________________</w:t>
+      </w:r>
+    </w:p>
     <w:bookmarkEnd w:id="69"/>
     <w:bookmarkStart w:id="70" w:name="day-30-set-your-review-date"/>
     <w:p>
@@ -2531,6 +3610,42 @@
         <w:t xml:space="preserve">Then read your one-page plan aloud once. Notice how it feels to hear it. If anything sounds untrue, change it now. When you are satisfied, put the page somewhere you will see it often, such as beside the kettle or on the fridge. Then close the workbook, and let yourself notice that you have finished something.</w:t>
       </w:r>
     </w:p>
+    <w:p>
+      <w:pPr>
+        <w:pStyle w:val="BodyText"/>
+      </w:pPr>
+      <w:r>
+        <w:rPr>
+          <w:bCs/>
+          <w:b/>
+        </w:rPr>
+        <w:t xml:space="preserve">Your answer:</w:t>
+      </w:r>
+    </w:p>
+    <w:p>
+      <w:pPr>
+        <w:pStyle w:val="BodyText"/>
+      </w:pPr>
+      <w:r>
+        <w:t xml:space="preserve">________________________________________</w:t>
+      </w:r>
+    </w:p>
+    <w:p>
+      <w:pPr>
+        <w:pStyle w:val="BodyText"/>
+      </w:pPr>
+      <w:r>
+        <w:t xml:space="preserve">________________________________________</w:t>
+      </w:r>
+    </w:p>
+    <w:p>
+      <w:pPr>
+        <w:pStyle w:val="BodyText"/>
+      </w:pPr>
+      <w:r>
+        <w:t xml:space="preserve">________________________________________</w:t>
+      </w:r>
+    </w:p>
     <w:bookmarkEnd w:id="70"/>
     <w:bookmarkStart w:id="71" w:name="going-further-keeping-the-plan-alive"/>
     <w:p>
@@ -2596,6 +3711,42 @@
         <w:pStyle w:val="BodyText"/>
       </w:pPr>
       <w:r>
+        <w:rPr>
+          <w:bCs/>
+          <w:b/>
+        </w:rPr>
+        <w:t xml:space="preserve">Your answer:</w:t>
+      </w:r>
+    </w:p>
+    <w:p>
+      <w:pPr>
+        <w:pStyle w:val="BodyText"/>
+      </w:pPr>
+      <w:r>
+        <w:t xml:space="preserve">________________________________________</w:t>
+      </w:r>
+    </w:p>
+    <w:p>
+      <w:pPr>
+        <w:pStyle w:val="BodyText"/>
+      </w:pPr>
+      <w:r>
+        <w:t xml:space="preserve">________________________________________</w:t>
+      </w:r>
+    </w:p>
+    <w:p>
+      <w:pPr>
+        <w:pStyle w:val="BodyText"/>
+      </w:pPr>
+      <w:r>
+        <w:t xml:space="preserve">________________________________________</w:t>
+      </w:r>
+    </w:p>
+    <w:p>
+      <w:pPr>
+        <w:pStyle w:val="BodyText"/>
+      </w:pPr>
+      <w:r>
         <w:t xml:space="preserve">Which relationships did I strengthen, and which did I let go, deliberately or otherwise?</w:t>
       </w:r>
     </w:p>
@@ -2604,6 +3755,42 @@
         <w:pStyle w:val="BodyText"/>
       </w:pPr>
       <w:r>
+        <w:rPr>
+          <w:bCs/>
+          <w:b/>
+        </w:rPr>
+        <w:t xml:space="preserve">Your answer:</w:t>
+      </w:r>
+    </w:p>
+    <w:p>
+      <w:pPr>
+        <w:pStyle w:val="BodyText"/>
+      </w:pPr>
+      <w:r>
+        <w:t xml:space="preserve">________________________________________</w:t>
+      </w:r>
+    </w:p>
+    <w:p>
+      <w:pPr>
+        <w:pStyle w:val="BodyText"/>
+      </w:pPr>
+      <w:r>
+        <w:t xml:space="preserve">________________________________________</w:t>
+      </w:r>
+    </w:p>
+    <w:p>
+      <w:pPr>
+        <w:pStyle w:val="BodyText"/>
+      </w:pPr>
+      <w:r>
+        <w:t xml:space="preserve">________________________________________</w:t>
+      </w:r>
+    </w:p>
+    <w:p>
+      <w:pPr>
+        <w:pStyle w:val="BodyText"/>
+      </w:pPr>
+      <w:r>
         <w:t xml:space="preserve">How did my weekly rhythm work in practice, and what would I change?</w:t>
       </w:r>
     </w:p>
@@ -2612,6 +3799,42 @@
         <w:pStyle w:val="BodyText"/>
       </w:pPr>
       <w:r>
+        <w:rPr>
+          <w:bCs/>
+          <w:b/>
+        </w:rPr>
+        <w:t xml:space="preserve">Your answer:</w:t>
+      </w:r>
+    </w:p>
+    <w:p>
+      <w:pPr>
+        <w:pStyle w:val="BodyText"/>
+      </w:pPr>
+      <w:r>
+        <w:t xml:space="preserve">________________________________________</w:t>
+      </w:r>
+    </w:p>
+    <w:p>
+      <w:pPr>
+        <w:pStyle w:val="BodyText"/>
+      </w:pPr>
+      <w:r>
+        <w:t xml:space="preserve">________________________________________</w:t>
+      </w:r>
+    </w:p>
+    <w:p>
+      <w:pPr>
+        <w:pStyle w:val="BodyText"/>
+      </w:pPr>
+      <w:r>
+        <w:t xml:space="preserve">________________________________________</w:t>
+      </w:r>
+    </w:p>
+    <w:p>
+      <w:pPr>
+        <w:pStyle w:val="BodyText"/>
+      </w:pPr>
+      <w:r>
         <w:t xml:space="preserve">Which friction turned out to be the most difficult, and how did I respond to it?</w:t>
       </w:r>
     </w:p>
@@ -2620,6 +3843,42 @@
         <w:pStyle w:val="BodyText"/>
       </w:pPr>
       <w:r>
+        <w:rPr>
+          <w:bCs/>
+          <w:b/>
+        </w:rPr>
+        <w:t xml:space="preserve">Your answer:</w:t>
+      </w:r>
+    </w:p>
+    <w:p>
+      <w:pPr>
+        <w:pStyle w:val="BodyText"/>
+      </w:pPr>
+      <w:r>
+        <w:t xml:space="preserve">________________________________________</w:t>
+      </w:r>
+    </w:p>
+    <w:p>
+      <w:pPr>
+        <w:pStyle w:val="BodyText"/>
+      </w:pPr>
+      <w:r>
+        <w:t xml:space="preserve">________________________________________</w:t>
+      </w:r>
+    </w:p>
+    <w:p>
+      <w:pPr>
+        <w:pStyle w:val="BodyText"/>
+      </w:pPr>
+      <w:r>
+        <w:t xml:space="preserve">________________________________________</w:t>
+      </w:r>
+    </w:p>
+    <w:p>
+      <w:pPr>
+        <w:pStyle w:val="BodyText"/>
+      </w:pPr>
+      <w:r>
         <w:t xml:space="preserve">What have I said yes to, and does each yes still match the values I chose?</w:t>
       </w:r>
     </w:p>
@@ -2628,6 +3887,42 @@
         <w:pStyle w:val="BodyText"/>
       </w:pPr>
       <w:r>
+        <w:rPr>
+          <w:bCs/>
+          <w:b/>
+        </w:rPr>
+        <w:t xml:space="preserve">Your answer:</w:t>
+      </w:r>
+    </w:p>
+    <w:p>
+      <w:pPr>
+        <w:pStyle w:val="BodyText"/>
+      </w:pPr>
+      <w:r>
+        <w:t xml:space="preserve">________________________________________</w:t>
+      </w:r>
+    </w:p>
+    <w:p>
+      <w:pPr>
+        <w:pStyle w:val="BodyText"/>
+      </w:pPr>
+      <w:r>
+        <w:t xml:space="preserve">________________________________________</w:t>
+      </w:r>
+    </w:p>
+    <w:p>
+      <w:pPr>
+        <w:pStyle w:val="BodyText"/>
+      </w:pPr>
+      <w:r>
+        <w:t xml:space="preserve">________________________________________</w:t>
+      </w:r>
+    </w:p>
+    <w:p>
+      <w:pPr>
+        <w:pStyle w:val="BodyText"/>
+      </w:pPr>
+      <w:r>
         <w:t xml:space="preserve">What is the one thing I am most glad I did in the last three months?</w:t>
       </w:r>
     </w:p>
@@ -2636,6 +3931,42 @@
         <w:pStyle w:val="BodyText"/>
       </w:pPr>
       <w:r>
+        <w:rPr>
+          <w:bCs/>
+          <w:b/>
+        </w:rPr>
+        <w:t xml:space="preserve">Your answer:</w:t>
+      </w:r>
+    </w:p>
+    <w:p>
+      <w:pPr>
+        <w:pStyle w:val="BodyText"/>
+      </w:pPr>
+      <w:r>
+        <w:t xml:space="preserve">________________________________________</w:t>
+      </w:r>
+    </w:p>
+    <w:p>
+      <w:pPr>
+        <w:pStyle w:val="BodyText"/>
+      </w:pPr>
+      <w:r>
+        <w:t xml:space="preserve">________________________________________</w:t>
+      </w:r>
+    </w:p>
+    <w:p>
+      <w:pPr>
+        <w:pStyle w:val="BodyText"/>
+      </w:pPr>
+      <w:r>
+        <w:t xml:space="preserve">________________________________________</w:t>
+      </w:r>
+    </w:p>
+    <w:p>
+      <w:pPr>
+        <w:pStyle w:val="BodyText"/>
+      </w:pPr>
+      <w:r>
         <w:t xml:space="preserve">What is the one thing I want to do in the next three months, and when will I start it?</w:t>
       </w:r>
     </w:p>
@@ -2644,7 +3975,79 @@
         <w:pStyle w:val="BodyText"/>
       </w:pPr>
       <w:r>
+        <w:rPr>
+          <w:bCs/>
+          <w:b/>
+        </w:rPr>
+        <w:t xml:space="preserve">Your answer:</w:t>
+      </w:r>
+    </w:p>
+    <w:p>
+      <w:pPr>
+        <w:pStyle w:val="BodyText"/>
+      </w:pPr>
+      <w:r>
+        <w:t xml:space="preserve">________________________________________</w:t>
+      </w:r>
+    </w:p>
+    <w:p>
+      <w:pPr>
+        <w:pStyle w:val="BodyText"/>
+      </w:pPr>
+      <w:r>
+        <w:t xml:space="preserve">________________________________________</w:t>
+      </w:r>
+    </w:p>
+    <w:p>
+      <w:pPr>
+        <w:pStyle w:val="BodyText"/>
+      </w:pPr>
+      <w:r>
+        <w:t xml:space="preserve">________________________________________</w:t>
+      </w:r>
+    </w:p>
+    <w:p>
+      <w:pPr>
+        <w:pStyle w:val="BodyText"/>
+      </w:pPr>
+      <w:r>
         <w:t xml:space="preserve">Looking back at the one-page plan, what needs to change, and what should stay the same?</w:t>
+      </w:r>
+    </w:p>
+    <w:p>
+      <w:pPr>
+        <w:pStyle w:val="BodyText"/>
+      </w:pPr>
+      <w:r>
+        <w:rPr>
+          <w:bCs/>
+          <w:b/>
+        </w:rPr>
+        <w:t xml:space="preserve">Your answer:</w:t>
+      </w:r>
+    </w:p>
+    <w:p>
+      <w:pPr>
+        <w:pStyle w:val="BodyText"/>
+      </w:pPr>
+      <w:r>
+        <w:t xml:space="preserve">________________________________________</w:t>
+      </w:r>
+    </w:p>
+    <w:p>
+      <w:pPr>
+        <w:pStyle w:val="BodyText"/>
+      </w:pPr>
+      <w:r>
+        <w:t xml:space="preserve">________________________________________</w:t>
+      </w:r>
+    </w:p>
+    <w:p>
+      <w:pPr>
+        <w:pStyle w:val="BodyText"/>
+      </w:pPr>
+      <w:r>
+        <w:t xml:space="preserve">________________________________________</w:t>
       </w:r>
     </w:p>
     <w:bookmarkEnd w:id="72"/>

</xml_diff>